<commit_message>
Update CA1 proposal references and add AI declaration and ethics form
</commit_message>
<xml_diff>
--- a/CA1-Credit-Default-Risk/2026328_Strategic_Thinking_CA1_Proposal_V1.docx
+++ b/CA1-Credit-Default-Risk/2026328_Strategic_Thinking_CA1_Proposal_V1.docx
@@ -932,7 +932,7 @@
                 <w:lang w:val="en-US"/>
                 <w14:ligatures w14:val="none"/>
               </w:rPr>
-              <w:t>______________________________</w:t>
+              <w:t>____________________________</w:t>
             </w:r>
           </w:p>
         </w:tc>
@@ -1019,22 +1019,37 @@
           <w:sz w:val="32"/>
         </w:rPr>
       </w:pPr>
-      <w:r>
+    </w:p>
+    <w:p>
+      <w:pPr>
+        <w:spacing w:after="160" w:line="278" w:lineRule="auto"/>
         <w:rPr>
           <w:rFonts w:ascii="Aptos Display" w:eastAsia="Aptos Display" w:hAnsi="Aptos Display"/>
           <w:b/>
           <w:bCs/>
           <w:sz w:val="32"/>
         </w:rPr>
-        <w:br w:type="page"/>
-      </w:r>
+      </w:pPr>
     </w:p>
     <w:p>
       <w:pPr>
-        <w:spacing w:after="200"/>
+        <w:spacing w:after="160" w:line="278" w:lineRule="auto"/>
         <w:rPr>
+          <w:rFonts w:ascii="Aptos Display" w:eastAsia="Aptos Display" w:hAnsi="Aptos Display"/>
           <w:b/>
           <w:bCs/>
+          <w:sz w:val="32"/>
+        </w:rPr>
+      </w:pPr>
+    </w:p>
+    <w:p>
+      <w:pPr>
+        <w:spacing w:after="160" w:line="278" w:lineRule="auto"/>
+        <w:rPr>
+          <w:rFonts w:ascii="Aptos Display" w:eastAsia="Aptos Display" w:hAnsi="Aptos Display"/>
+          <w:b/>
+          <w:bCs/>
+          <w:sz w:val="32"/>
         </w:rPr>
       </w:pPr>
       <w:r>
@@ -1076,8 +1091,12 @@
       </w:r>
     </w:p>
     <w:p>
+      <w:pPr>
+        <w:keepNext/>
+        <w:spacing w:before="160" w:after="80"/>
+      </w:pPr>
       <w:r>
-        <w:t>Credit risk is an important issue for financial institutions because customer default can cause financial losses. Banks and credit card companies need to understand which customers may have a higher risk of not making their payments on time. Historical credit and repayment data can provide useful information about customer behaviour. This project will use data analytics and machine learning techniques to analyse customer payment history and predict the risk of credit card default. The results may help financial institutions understand important risk factors and support better credit-risk decisions.</w:t>
+        <w:t>Credit risk is an important issue for financial institutions because customer default can cause financial losses. Banks and credit card companies need to identify customers who may have a higher risk of missing payments. Historical credit and repayment data can provide useful information about customer behaviour. This project will use data analytics and machine learning to analyse payment history, predict credit card default risk and support better credit-risk decisions.</w:t>
       </w:r>
     </w:p>
     <w:p>
@@ -1101,8 +1120,12 @@
       </w:r>
     </w:p>
     <w:p>
+      <w:pPr>
+        <w:keepNext/>
+        <w:spacing w:before="160" w:after="80"/>
+      </w:pPr>
       <w:r>
-        <w:t>Financial institutions can face difficulties when identifying customers who are likely to default on their credit payments. If default risk is not assessed correctly, the organisation may face financial losses. On the other hand, an overly strict risk assessment may also affect customers who are able to repay their credit. Therefore, there is a need for a data-driven method to analyse customer credit behaviour and identify patterns related to default. Machine learning can be used to estimate the probability of default and provide useful information for credit-risk management.</w:t>
+        <w:t>Financial institutions need to identify customers who may default while avoiding overly strict treatment of reliable customers. Poor risk assessment can lead to financial losses, while incorrect high-risk classification may also affect customers who can repay. A data-driven approach can analyse credit behaviour and identify patterns related to default. This project will use machine learning to estimate default probability and support credit-risk management.</w:t>
       </w:r>
     </w:p>
     <w:p>
@@ -1125,11 +1148,12 @@
       </w:r>
     </w:p>
     <w:p>
+      <w:pPr>
+        <w:keepNext/>
+        <w:spacing w:before="160" w:after="80"/>
+      </w:pPr>
       <w:r>
-        <w:t>The aim of this project is to develop and evaluate a machine learning model that can predict the risk of credit card default using historical customer credit and repayment data.</w:t>
-      </w:r>
-      <w:r>
-        <w:t xml:space="preserve"> The project will investigate whether historical credit and repayment behaviour can be used to predict customer default risk.</w:t>
+        <w:t>The aim of this project is to develop and evaluate a machine learning model that predicts credit card default risk using historical credit and repayment data. The project will test whether repayment behaviour can help identify customers with a higher probability of default.</w:t>
       </w:r>
     </w:p>
     <w:p>
@@ -1154,61 +1178,71 @@
     <w:p>
       <w:pPr>
         <w:pStyle w:val="ListParagraph"/>
+        <w:keepNext/>
         <w:numPr>
           <w:ilvl w:val="0"/>
-          <w:numId w:val="2"/>
+          <w:numId w:val="3"/>
         </w:numPr>
+        <w:spacing w:before="160" w:after="80"/>
       </w:pPr>
       <w:r>
-        <w:t>To analyse historical credit and repayment data to identify patterns related to customer default.</w:t>
+        <w:t>To analyse historical credit and repayment data for patterns related to customer default.</w:t>
       </w:r>
     </w:p>
     <w:p>
       <w:pPr>
         <w:pStyle w:val="ListParagraph"/>
+        <w:keepNext/>
         <w:numPr>
           <w:ilvl w:val="0"/>
-          <w:numId w:val="2"/>
+          <w:numId w:val="3"/>
         </w:numPr>
+        <w:spacing w:before="160" w:after="80"/>
       </w:pPr>
       <w:r>
-        <w:t>To prepare and clean the dataset for data analysis and predictive modelling.</w:t>
+        <w:t>To clean and prepare the dataset for analysis and predictive modelling.</w:t>
       </w:r>
     </w:p>
     <w:p>
       <w:pPr>
         <w:pStyle w:val="ListParagraph"/>
+        <w:keepNext/>
         <w:numPr>
           <w:ilvl w:val="0"/>
-          <w:numId w:val="2"/>
+          <w:numId w:val="3"/>
         </w:numPr>
+        <w:spacing w:before="160" w:after="80"/>
       </w:pPr>
       <w:r>
-        <w:t>To develop and compare suitable machine learning classification models for default prediction.</w:t>
+        <w:t>To develop and compare suitable classification models for default prediction.</w:t>
       </w:r>
     </w:p>
     <w:p>
       <w:pPr>
         <w:pStyle w:val="ListParagraph"/>
+        <w:keepNext/>
         <w:numPr>
           <w:ilvl w:val="0"/>
-          <w:numId w:val="2"/>
+          <w:numId w:val="3"/>
         </w:numPr>
+        <w:spacing w:before="160" w:after="80"/>
       </w:pPr>
       <w:r>
-        <w:t>To evaluate the models using appropriate measures such as precision, recall, F1-score and ROC-AUC.</w:t>
+        <w:t>To evaluate the models using precision, recall, F1-score and ROC-AUC.</w:t>
       </w:r>
     </w:p>
     <w:p>
       <w:pPr>
         <w:pStyle w:val="ListParagraph"/>
+        <w:keepNext/>
         <w:numPr>
           <w:ilvl w:val="0"/>
-          <w:numId w:val="2"/>
+          <w:numId w:val="3"/>
         </w:numPr>
+        <w:spacing w:before="160" w:after="80"/>
       </w:pPr>
       <w:r>
-        <w:t>To present the prediction results in a simple decision-support system or dashboard.</w:t>
+        <w:t>To present prediction results in a simple decision-support dashboard.</w:t>
       </w:r>
     </w:p>
     <w:p>
@@ -1216,8 +1250,10 @@
         <w:keepNext/>
         <w:spacing w:before="160" w:after="80"/>
         <w:rPr>
+          <w:rFonts w:ascii="Aptos Display" w:eastAsia="Aptos Display" w:hAnsi="Aptos Display"/>
           <w:b/>
           <w:bCs/>
+          <w:sz w:val="28"/>
         </w:rPr>
       </w:pPr>
       <w:r>
@@ -1232,14 +1268,23 @@
     </w:p>
     <w:p>
       <w:r>
-        <w:t>This project will focus on analysing historical credit card customer data and developing machine learning models to predict the risk of default. The analysis will include data cleaning, exploratory data analysis, feature preparation, model development and model evaluation. Several classification models will be compared to identify a suitable model for predicting customer default risk. The project may also include a simple dashboard or decision-support output to present prediction results clearly.</w:t>
+        <w:t>This project will analyse historical credit card customer data and develop classification models to predict default risk. It will include data cleaning, exploratory analysis, feature preparation, model development and evaluation. Several models will be compared, and a simple dashboard may be used to present the prediction results. The selected dataset focuses on existing credit-card customers with historical repayment information.</w:t>
       </w:r>
     </w:p>
     <w:p>
       <w:r>
-        <w:lastRenderedPageBreak/>
-        <w:t>The project will not make real lending decisions or provide automatic loan approval or rejection. It will not use confidential customer information or personally identifiable data. The model will be developed for academic and research purposes using an anonymised public dataset.</w:t>
+        <w:t>The project will not make real lending decisions or automatic loan approvals or rejections. It will use only an anonymised public dataset and will not include confidential or personally identifiable customer information.</w:t>
       </w:r>
+    </w:p>
+    <w:p>
+      <w:pPr>
+        <w:keepNext/>
+        <w:spacing w:before="160" w:after="80"/>
+        <w:rPr>
+          <w:b/>
+          <w:bCs/>
+        </w:rPr>
+      </w:pPr>
     </w:p>
     <w:p>
       <w:pPr>
@@ -1262,17 +1307,17 @@
     </w:p>
     <w:p>
       <w:r>
-        <w:t>The project will follow a structured data analytics and machine learning process. First, the dataset will be reviewed and cleaned to check data quality, missing values and incorrect values. Exploratory data analysis will then be used to understand the main variables, customer payment behaviour and patterns related to default.</w:t>
+        <w:t>The project will follow a structured data analytics and machine learning process. The dataset will first be reviewed and cleaned for data quality, missing values and incorrect values. Exploratory data analysis will then examine key variables, payment behaviour and patterns related to default. The prepared data will be divided into training and testing sets before model development.</w:t>
       </w:r>
     </w:p>
     <w:p>
       <w:r>
-        <w:t>After data preparation, suitable classification models will be developed because the target variable is whether a customer defaults or not. Logistic Regression will be used as a baseline model because it is simple and easy to interpret. Other models such as Decision Tree, Random Forest and Gradient Boosting may also be tested and compared. The models will be evaluated using measures such as precision, recall, F1-score and ROC-AUC.</w:t>
+        <w:t>Because the target is whether a customer defaults, classification models will be used. Logistic Regression will provide a simple, interpretable baseline. Decision Tree, Random Forest and Gradient Boosting will also be tested and compared. Performance will be evaluated using precision, recall, F1-score and ROC-AUC.</w:t>
       </w:r>
     </w:p>
     <w:p>
       <w:r>
-        <w:t>Python will be used for data analysis and machine learning, with libraries such as Pandas, NumPy and Scikit-learn. Jupyter Notebook will be used for development and testing, while GitHub will be used for version control. A simple dashboard or decision-support interface may also be developed to present the final prediction results.</w:t>
+        <w:t>Python, Pandas, NumPy and Scikit-learn will be used for analysis and modelling. Jupyter Notebook will support development and testing, while GitHub will provide version control. A simple dashboard or decision-support interface may present the final predictions.</w:t>
       </w:r>
     </w:p>
     <w:tbl>
@@ -2642,18 +2687,17 @@
     </w:p>
     <w:p>
       <w:r>
-        <w:t>This project will use the “Default of Credit Card Clients” dataset from the UCI Machine Learning Repository. The dataset contains 30,000 customer records and 23 explanatory variables. These variables include credit limit, age, education, marital status, repayment history, bill amounts and previous payment amounts. The target variable shows whether a customer defaulted on their credit card payment in the following month.</w:t>
+        <w:t>This project will use the UCI “Default of Credit Card Clients” dataset, containing 30,000 records and 23 explanatory variables. These include credit limit, age, education, marital status, repayment history, bill amounts and previous payments. The target shows whether a customer defaulted in the following month.</w:t>
       </w:r>
     </w:p>
     <w:p>
       <w:r>
-        <w:t>The dataset is relevant to this project because it contains historical credit and repayment information that can be used to identify patterns related to default risk. It is suitable for classification and predictive modelling. The dataset is publicly available and is licensed under the Creative Commons Attribution 4.0 International licence, which allows it to be used and adapted when appropriate credit is provided. UCI Machine Learning Repository</w:t>
+        <w:t>The dataset is relevant because its historical credit and repayment information supports classification and default-risk prediction. It is publicly available under the Creative Commons Attribution 4.0 International licence and may be used with appropriate credit.</w:t>
       </w:r>
     </w:p>
     <w:p>
       <w:r>
-        <w:lastRenderedPageBreak/>
-        <w:t>One limitation is that the data represents credit card customers in Taiwan and is based on historical payment records from 2005. Therefore, the results of this project will not be presented as directly representative of current customers in Ireland.</w:t>
+        <w:t>A limitation is that the data represents Taiwanese credit card customers and payment records from 2005, so the results will not be treated as representative of current customers in Ireland.</w:t>
       </w:r>
     </w:p>
     <w:p>
@@ -2677,12 +2721,12 @@
     </w:p>
     <w:p>
       <w:r>
-        <w:t>By the end of Semester 2, the project is expected to produce a complete analysis of the credit card default dataset and a machine learning model that can predict customer default risk. Several classification models will be compared, and the most suitable model will be selected based on its performance.</w:t>
+        <w:t>By the end of Semester 2, the project will produce an analysis of the dataset and a machine learning model for predicting default risk. Several classification models will be compared, and the best-performing model will be selected.</w:t>
       </w:r>
     </w:p>
     <w:p>
       <w:r>
-        <w:t>The final outputs will include data analysis results, model evaluation results and a simple decision-support dashboard or interface. The dashboard will present information such as the predicted probability of default and the customer risk category. The project will also include supporting documentation explaining the methodology, model performance and main findings.</w:t>
+        <w:t>Final outputs will include model evaluation, a decision-support dashboard showing default probability and risk category, and documentation of the methodology and main findings.</w:t>
       </w:r>
     </w:p>
     <w:p>
@@ -2701,12 +2745,13 @@
           <w:bCs/>
           <w:sz w:val="28"/>
         </w:rPr>
+        <w:lastRenderedPageBreak/>
         <w:t>9. Project Timeline</w:t>
       </w:r>
     </w:p>
     <w:p>
       <w:r>
-        <w:t>The project will be developed across two semesters. During Semester 1, the main focus will be on defining the business problem, reviewing relevant literature, selecting and understanding the dataset, and carrying out initial data preparation and exploratory analysis. During Semester 2, the project will focus on feature preparation, model development, model comparison, evaluation and the development of a simple decision-support dashboard. The final stage will include testing, documentation and preparation of the final project report.</w:t>
+        <w:t>The project will run across two semesters. Semester 1 will cover the business problem, literature review, dataset selection and exploratory analysis. Semester 2 will cover feature preparation, modelling, evaluation, dashboard development, testing and the final report.</w:t>
       </w:r>
     </w:p>
     <w:tbl>
@@ -5687,18 +5732,309 @@
     </w:p>
     <w:p>
       <w:r>
-        <w:t xml:space="preserve">This project will use a publicly available and anonymised dataset for academic research purposes. No personal identifiers will be used in the analysis. The data will be handled </w:t>
-      </w:r>
-      <w:r>
-        <w:lastRenderedPageBreak/>
-        <w:t>carefully and will only be used for the purposes described in this project. The dataset licence and usage conditions will also be followed.</w:t>
+        <w:t>This project uses a public, anonymised dataset for academic research. No personal identifiers are included, and the dataset licence and usage conditions will be followed.</w:t>
       </w:r>
     </w:p>
     <w:p>
       <w:r>
-        <w:t>Credit-risk prediction can raise ethical concerns because model results may affect different groups of customers in different ways. Therefore, the project will consider possible bias in the data and model results. The model will be used only for research and decision-support purposes and will not be used to make real lending decisions. The project will also follow appropriate data protection, privacy and security principles.</w:t>
+        <w:t>Credit-risk prediction may affect groups differently, so possible bias will be considered. The model will support research only and follow data protection, privacy and security principles.</w:t>
       </w:r>
     </w:p>
+    <w:p>
+      <w:pPr>
+        <w:spacing w:before="100" w:beforeAutospacing="1" w:after="100" w:afterAutospacing="1" w:line="240" w:lineRule="auto"/>
+        <w:outlineLvl w:val="2"/>
+        <w:rPr>
+          <w:rFonts w:eastAsia="Times New Roman" w:cs="Times New Roman"/>
+          <w:b/>
+          <w:bCs/>
+          <w:kern w:val="0"/>
+          <w:sz w:val="28"/>
+          <w:szCs w:val="28"/>
+          <w:lang w:eastAsia="en-GB"/>
+          <w14:ligatures w14:val="none"/>
+        </w:rPr>
+      </w:pPr>
+      <w:r>
+        <w:rPr>
+          <w:rFonts w:eastAsia="Times New Roman" w:cs="Times New Roman"/>
+          <w:b/>
+          <w:bCs/>
+          <w:kern w:val="0"/>
+          <w:sz w:val="28"/>
+          <w:szCs w:val="28"/>
+          <w:lang w:eastAsia="en-GB"/>
+          <w14:ligatures w14:val="none"/>
+        </w:rPr>
+        <w:t>11. References</w:t>
+      </w:r>
+    </w:p>
+    <w:p>
+      <w:pPr>
+        <w:spacing w:before="100" w:beforeAutospacing="1" w:after="100" w:afterAutospacing="1" w:line="240" w:lineRule="auto"/>
+        <w:rPr>
+          <w:rFonts w:eastAsia="Times New Roman" w:cs="Times New Roman"/>
+          <w:kern w:val="0"/>
+          <w:szCs w:val="23"/>
+          <w:lang w:eastAsia="en-GB"/>
+          <w14:ligatures w14:val="none"/>
+        </w:rPr>
+      </w:pPr>
+      <w:r>
+        <w:rPr>
+          <w:rFonts w:eastAsia="Times New Roman" w:cs="Times New Roman"/>
+          <w:kern w:val="0"/>
+          <w:szCs w:val="23"/>
+          <w:lang w:eastAsia="en-GB"/>
+          <w14:ligatures w14:val="none"/>
+        </w:rPr>
+        <w:t xml:space="preserve">Yeh, I.-C. (2009) </w:t>
+      </w:r>
+      <w:r>
+        <w:rPr>
+          <w:rFonts w:eastAsia="Times New Roman" w:cs="Times New Roman"/>
+          <w:i/>
+          <w:iCs/>
+          <w:kern w:val="0"/>
+          <w:szCs w:val="23"/>
+          <w:lang w:eastAsia="en-GB"/>
+          <w14:ligatures w14:val="none"/>
+        </w:rPr>
+        <w:t>Default of Credit Card Clients</w:t>
+      </w:r>
+      <w:r>
+        <w:rPr>
+          <w:rFonts w:eastAsia="Times New Roman" w:cs="Times New Roman"/>
+          <w:kern w:val="0"/>
+          <w:szCs w:val="23"/>
+          <w:lang w:eastAsia="en-GB"/>
+          <w14:ligatures w14:val="none"/>
+        </w:rPr>
+        <w:t xml:space="preserve"> [Dataset]. UCI Machine Learning Repository. Available at: </w:t>
+      </w:r>
+      <w:hyperlink r:id="rId9" w:history="1">
+        <w:r>
+          <w:rPr>
+            <w:rFonts w:eastAsia="Times New Roman" w:cs="Times New Roman"/>
+            <w:color w:val="0000FF"/>
+            <w:kern w:val="0"/>
+            <w:szCs w:val="23"/>
+            <w:u w:val="single"/>
+            <w:lang w:eastAsia="en-GB"/>
+            <w14:ligatures w14:val="none"/>
+          </w:rPr>
+          <w:t>https://doi.org/10.24432/C55S3H</w:t>
+        </w:r>
+      </w:hyperlink>
+      <w:r>
+        <w:rPr>
+          <w:rFonts w:eastAsia="Times New Roman" w:cs="Times New Roman"/>
+          <w:kern w:val="0"/>
+          <w:szCs w:val="23"/>
+          <w:lang w:eastAsia="en-GB"/>
+          <w14:ligatures w14:val="none"/>
+        </w:rPr>
+        <w:t xml:space="preserve"> (Accessed: 13 October 2026). </w:t>
+      </w:r>
+      <w:hyperlink r:id="rId10" w:history="1">
+        <w:r>
+          <w:rPr>
+            <w:rFonts w:eastAsia="Times New Roman" w:cs="Times New Roman"/>
+            <w:color w:val="0000FF"/>
+            <w:kern w:val="0"/>
+            <w:szCs w:val="23"/>
+            <w:u w:val="single"/>
+            <w:lang w:eastAsia="en-GB"/>
+            <w14:ligatures w14:val="none"/>
+          </w:rPr>
+          <w:t>UCI Archive</w:t>
+        </w:r>
+      </w:hyperlink>
+    </w:p>
+    <w:p>
+      <w:pPr>
+        <w:spacing w:before="100" w:beforeAutospacing="1" w:after="100" w:afterAutospacing="1" w:line="240" w:lineRule="auto"/>
+        <w:rPr>
+          <w:rFonts w:eastAsia="Times New Roman" w:cs="Times New Roman"/>
+          <w:kern w:val="0"/>
+          <w:szCs w:val="23"/>
+          <w:lang w:eastAsia="en-GB"/>
+          <w14:ligatures w14:val="none"/>
+        </w:rPr>
+      </w:pPr>
+      <w:r>
+        <w:rPr>
+          <w:rFonts w:eastAsia="Times New Roman" w:cs="Times New Roman"/>
+          <w:kern w:val="0"/>
+          <w:szCs w:val="23"/>
+          <w:lang w:eastAsia="en-GB"/>
+          <w14:ligatures w14:val="none"/>
+        </w:rPr>
+        <w:t xml:space="preserve">Yeh, I.-C. and Lien, C.-H. (2009) ‘The comparisons of data mining techniques for the predictive accuracy of probability of default of credit card clients’, </w:t>
+      </w:r>
+      <w:r>
+        <w:rPr>
+          <w:rFonts w:eastAsia="Times New Roman" w:cs="Times New Roman"/>
+          <w:i/>
+          <w:iCs/>
+          <w:kern w:val="0"/>
+          <w:szCs w:val="23"/>
+          <w:lang w:eastAsia="en-GB"/>
+          <w14:ligatures w14:val="none"/>
+        </w:rPr>
+        <w:t>Expert Systems with Applications</w:t>
+      </w:r>
+      <w:r>
+        <w:rPr>
+          <w:rFonts w:eastAsia="Times New Roman" w:cs="Times New Roman"/>
+          <w:kern w:val="0"/>
+          <w:szCs w:val="23"/>
+          <w:lang w:eastAsia="en-GB"/>
+          <w14:ligatures w14:val="none"/>
+        </w:rPr>
+        <w:t xml:space="preserve">, 36(2), pp. 2473–2480. </w:t>
+      </w:r>
+      <w:proofErr w:type="spellStart"/>
+      <w:r>
+        <w:rPr>
+          <w:rFonts w:eastAsia="Times New Roman" w:cs="Times New Roman"/>
+          <w:kern w:val="0"/>
+          <w:szCs w:val="23"/>
+          <w:lang w:eastAsia="en-GB"/>
+          <w14:ligatures w14:val="none"/>
+        </w:rPr>
+        <w:t>doi</w:t>
+      </w:r>
+      <w:proofErr w:type="spellEnd"/>
+      <w:r>
+        <w:rPr>
+          <w:rFonts w:eastAsia="Times New Roman" w:cs="Times New Roman"/>
+          <w:kern w:val="0"/>
+          <w:szCs w:val="23"/>
+          <w:lang w:eastAsia="en-GB"/>
+          <w14:ligatures w14:val="none"/>
+        </w:rPr>
+        <w:t xml:space="preserve">: 10.1016/j.eswa.2007.12.020. </w:t>
+      </w:r>
+      <w:hyperlink r:id="rId11" w:history="1">
+        <w:r>
+          <w:rPr>
+            <w:rFonts w:eastAsia="Times New Roman" w:cs="Times New Roman"/>
+            <w:color w:val="0000FF"/>
+            <w:kern w:val="0"/>
+            <w:szCs w:val="23"/>
+            <w:u w:val="single"/>
+            <w:lang w:eastAsia="en-GB"/>
+            <w14:ligatures w14:val="none"/>
+          </w:rPr>
+          <w:t>ScienceDirect</w:t>
+        </w:r>
+      </w:hyperlink>
+    </w:p>
+    <w:p>
+      <w:pPr>
+        <w:spacing w:before="100" w:beforeAutospacing="1" w:after="100" w:afterAutospacing="1" w:line="240" w:lineRule="auto"/>
+        <w:rPr>
+          <w:rFonts w:eastAsia="Times New Roman" w:cs="Times New Roman"/>
+          <w:kern w:val="0"/>
+          <w:szCs w:val="23"/>
+          <w:lang w:eastAsia="en-GB"/>
+          <w14:ligatures w14:val="none"/>
+        </w:rPr>
+      </w:pPr>
+      <w:r>
+        <w:rPr>
+          <w:rFonts w:eastAsia="Times New Roman" w:cs="Times New Roman"/>
+          <w:kern w:val="0"/>
+          <w:szCs w:val="23"/>
+          <w:lang w:eastAsia="en-GB"/>
+          <w14:ligatures w14:val="none"/>
+        </w:rPr>
+        <w:t xml:space="preserve">Pedregosa, F. et al. (2011) ‘Scikit-learn: Machine Learning in Python’, </w:t>
+      </w:r>
+      <w:r>
+        <w:rPr>
+          <w:rFonts w:eastAsia="Times New Roman" w:cs="Times New Roman"/>
+          <w:i/>
+          <w:iCs/>
+          <w:kern w:val="0"/>
+          <w:szCs w:val="23"/>
+          <w:lang w:eastAsia="en-GB"/>
+          <w14:ligatures w14:val="none"/>
+        </w:rPr>
+        <w:t>Journal of Machine Learning Research</w:t>
+      </w:r>
+      <w:r>
+        <w:rPr>
+          <w:rFonts w:eastAsia="Times New Roman" w:cs="Times New Roman"/>
+          <w:kern w:val="0"/>
+          <w:szCs w:val="23"/>
+          <w:lang w:eastAsia="en-GB"/>
+          <w14:ligatures w14:val="none"/>
+        </w:rPr>
+        <w:t xml:space="preserve">, 12, pp. 2825–2830. </w:t>
+      </w:r>
+      <w:hyperlink r:id="rId12" w:history="1">
+        <w:r>
+          <w:rPr>
+            <w:rFonts w:eastAsia="Times New Roman" w:cs="Times New Roman"/>
+            <w:color w:val="0000FF"/>
+            <w:kern w:val="0"/>
+            <w:szCs w:val="23"/>
+            <w:u w:val="single"/>
+            <w:lang w:eastAsia="en-GB"/>
+            <w14:ligatures w14:val="none"/>
+          </w:rPr>
+          <w:t>Journal of Machine Learning Research</w:t>
+        </w:r>
+      </w:hyperlink>
+    </w:p>
+    <w:p>
+      <w:pPr>
+        <w:spacing w:before="100" w:beforeAutospacing="1" w:after="100" w:afterAutospacing="1" w:line="240" w:lineRule="auto"/>
+        <w:rPr>
+          <w:rFonts w:eastAsia="Times New Roman" w:cs="Times New Roman"/>
+          <w:kern w:val="0"/>
+          <w:szCs w:val="23"/>
+          <w:lang w:eastAsia="en-GB"/>
+          <w14:ligatures w14:val="none"/>
+        </w:rPr>
+      </w:pPr>
+      <w:r>
+        <w:rPr>
+          <w:rFonts w:eastAsia="Times New Roman" w:cs="Times New Roman"/>
+          <w:kern w:val="0"/>
+          <w:szCs w:val="23"/>
+          <w:lang w:eastAsia="en-GB"/>
+          <w14:ligatures w14:val="none"/>
+        </w:rPr>
+        <w:t xml:space="preserve">European Parliament and Council of the European Union (2016) </w:t>
+      </w:r>
+      <w:r>
+        <w:rPr>
+          <w:rFonts w:eastAsia="Times New Roman" w:cs="Times New Roman"/>
+          <w:i/>
+          <w:iCs/>
+          <w:kern w:val="0"/>
+          <w:szCs w:val="23"/>
+          <w:lang w:eastAsia="en-GB"/>
+          <w14:ligatures w14:val="none"/>
+        </w:rPr>
+        <w:t>Regulation (EU) 2016/679 (General Data Protection Regulation)</w:t>
+      </w:r>
+      <w:r>
+        <w:rPr>
+          <w:rFonts w:eastAsia="Times New Roman" w:cs="Times New Roman"/>
+          <w:kern w:val="0"/>
+          <w:szCs w:val="23"/>
+          <w:lang w:eastAsia="en-GB"/>
+          <w14:ligatures w14:val="none"/>
+        </w:rPr>
+        <w:t xml:space="preserve">. Official Journal of the European Union, L119, pp. 1–88. </w:t>
+      </w:r>
+    </w:p>
+    <w:p/>
+    <w:p/>
     <w:sectPr>
       <w:pgSz w:w="11906" w:h="16838"/>
       <w:pgMar w:top="1152" w:right="1296" w:bottom="1152" w:left="1296" w:header="720" w:footer="720" w:gutter="0"/>
@@ -5936,11 +6272,100 @@
       </w:pPr>
     </w:lvl>
   </w:abstractNum>
+  <w:abstractNum w:abstractNumId="2" w15:restartNumberingAfterBreak="0">
+    <w:nsid w:val="6A603C4A"/>
+    <w:multiLevelType w:val="hybridMultilevel"/>
+    <w:tmpl w:val="26B204AC"/>
+    <w:lvl w:ilvl="0" w:tplc="0809000F">
+      <w:start w:val="1"/>
+      <w:numFmt w:val="decimal"/>
+      <w:lvlText w:val="%1."/>
+      <w:lvlJc w:val="left"/>
+      <w:pPr>
+        <w:ind w:left="720" w:hanging="360"/>
+      </w:pPr>
+    </w:lvl>
+    <w:lvl w:ilvl="1" w:tplc="08090019" w:tentative="1">
+      <w:start w:val="1"/>
+      <w:numFmt w:val="lowerLetter"/>
+      <w:lvlText w:val="%2."/>
+      <w:lvlJc w:val="left"/>
+      <w:pPr>
+        <w:ind w:left="1440" w:hanging="360"/>
+      </w:pPr>
+    </w:lvl>
+    <w:lvl w:ilvl="2" w:tplc="0809001B" w:tentative="1">
+      <w:start w:val="1"/>
+      <w:numFmt w:val="lowerRoman"/>
+      <w:lvlText w:val="%3."/>
+      <w:lvlJc w:val="right"/>
+      <w:pPr>
+        <w:ind w:left="2160" w:hanging="180"/>
+      </w:pPr>
+    </w:lvl>
+    <w:lvl w:ilvl="3" w:tplc="0809000F" w:tentative="1">
+      <w:start w:val="1"/>
+      <w:numFmt w:val="decimal"/>
+      <w:lvlText w:val="%4."/>
+      <w:lvlJc w:val="left"/>
+      <w:pPr>
+        <w:ind w:left="2880" w:hanging="360"/>
+      </w:pPr>
+    </w:lvl>
+    <w:lvl w:ilvl="4" w:tplc="08090019" w:tentative="1">
+      <w:start w:val="1"/>
+      <w:numFmt w:val="lowerLetter"/>
+      <w:lvlText w:val="%5."/>
+      <w:lvlJc w:val="left"/>
+      <w:pPr>
+        <w:ind w:left="3600" w:hanging="360"/>
+      </w:pPr>
+    </w:lvl>
+    <w:lvl w:ilvl="5" w:tplc="0809001B" w:tentative="1">
+      <w:start w:val="1"/>
+      <w:numFmt w:val="lowerRoman"/>
+      <w:lvlText w:val="%6."/>
+      <w:lvlJc w:val="right"/>
+      <w:pPr>
+        <w:ind w:left="4320" w:hanging="180"/>
+      </w:pPr>
+    </w:lvl>
+    <w:lvl w:ilvl="6" w:tplc="0809000F" w:tentative="1">
+      <w:start w:val="1"/>
+      <w:numFmt w:val="decimal"/>
+      <w:lvlText w:val="%7."/>
+      <w:lvlJc w:val="left"/>
+      <w:pPr>
+        <w:ind w:left="5040" w:hanging="360"/>
+      </w:pPr>
+    </w:lvl>
+    <w:lvl w:ilvl="7" w:tplc="08090019" w:tentative="1">
+      <w:start w:val="1"/>
+      <w:numFmt w:val="lowerLetter"/>
+      <w:lvlText w:val="%8."/>
+      <w:lvlJc w:val="left"/>
+      <w:pPr>
+        <w:ind w:left="5760" w:hanging="360"/>
+      </w:pPr>
+    </w:lvl>
+    <w:lvl w:ilvl="8" w:tplc="0809001B" w:tentative="1">
+      <w:start w:val="1"/>
+      <w:numFmt w:val="lowerRoman"/>
+      <w:lvlText w:val="%9."/>
+      <w:lvlJc w:val="right"/>
+      <w:pPr>
+        <w:ind w:left="6480" w:hanging="180"/>
+      </w:pPr>
+    </w:lvl>
+  </w:abstractNum>
   <w:num w:numId="1" w16cid:durableId="1611664062">
     <w:abstractNumId w:val="1"/>
   </w:num>
   <w:num w:numId="2" w16cid:durableId="331878494">
     <w:abstractNumId w:val="0"/>
+  </w:num>
+  <w:num w:numId="3" w16cid:durableId="876772389">
+    <w:abstractNumId w:val="2"/>
   </w:num>
 </w:numbering>
 </file>

</xml_diff>